<commit_message>
Actualización del proyecto Puklla2025
</commit_message>
<xml_diff>
--- a/public/pdf/CaratulaTesis-2025-PPD.docx
+++ b/public/pdf/CaratulaTesis-2025-PPD.docx
@@ -656,726 +656,6 @@
           <w:szCs w:val="24"/>
         </w:rPr>
         <w:t>AÑO</w:t>
-      </w:r>
-      <w:r>
-        <w:rPr>
-          <w:rFonts w:ascii="Arial" w:eastAsia="Arial" w:hAnsi="Arial" w:cs="Arial"/>
-          <w:sz w:val="24"/>
-          <w:szCs w:val="24"/>
-        </w:rPr>
-        <w:br w:type="page"/>
-      </w:r>
-    </w:p>
-    <w:p>
-      <w:pPr>
-        <w:spacing w:after="0" w:line="360" w:lineRule="auto"/>
-        <w:jc w:val="center"/>
-        <w:rPr>
-          <w:rFonts w:ascii="Arial" w:eastAsia="Arial" w:hAnsi="Arial" w:cs="Arial"/>
-          <w:b/>
-          <w:sz w:val="36"/>
-          <w:szCs w:val="36"/>
-        </w:rPr>
-      </w:pPr>
-      <w:r>
-        <w:rPr>
-          <w:rFonts w:ascii="Arial" w:eastAsia="Arial" w:hAnsi="Arial" w:cs="Arial"/>
-          <w:b/>
-          <w:sz w:val="36"/>
-          <w:szCs w:val="36"/>
-        </w:rPr>
-        <w:lastRenderedPageBreak/>
-        <w:t>ESCUELA DE EDUCACIÓN SUPERIOR PEDAGÓGICA PRIVADA PUKLLASUNCHIS</w:t>
-      </w:r>
-    </w:p>
-    <w:p>
-      <w:pPr>
-        <w:spacing w:after="0" w:line="360" w:lineRule="auto"/>
-        <w:jc w:val="center"/>
-        <w:rPr>
-          <w:rFonts w:ascii="Arial" w:eastAsia="Arial" w:hAnsi="Arial" w:cs="Arial"/>
-          <w:b/>
-          <w:sz w:val="32"/>
-          <w:szCs w:val="32"/>
-        </w:rPr>
-      </w:pPr>
-      <w:r>
-        <w:rPr>
-          <w:rFonts w:ascii="Arial" w:hAnsi="Arial" w:cs="Arial"/>
-          <w:b/>
-          <w:sz w:val="32"/>
-          <w:szCs w:val="32"/>
-        </w:rPr>
-        <w:t>PROGRAMA DE FORMACIÓN INICIAL DOCENTE</w:t>
-      </w:r>
-    </w:p>
-    <w:p>
-      <w:pPr>
-        <w:spacing w:after="0" w:line="360" w:lineRule="auto"/>
-        <w:jc w:val="center"/>
-        <w:rPr>
-          <w:rFonts w:ascii="Arial" w:eastAsia="Arial" w:hAnsi="Arial" w:cs="Arial"/>
-          <w:b/>
-          <w:sz w:val="32"/>
-          <w:szCs w:val="32"/>
-        </w:rPr>
-      </w:pPr>
-      <w:r>
-        <w:rPr>
-          <w:rFonts w:ascii="Arial" w:eastAsia="Arial" w:hAnsi="Arial" w:cs="Arial"/>
-          <w:b/>
-          <w:sz w:val="32"/>
-          <w:szCs w:val="32"/>
-        </w:rPr>
-        <w:t xml:space="preserve">PROGRAMA DE </w:t>
-      </w:r>
-      <w:r>
-        <w:rPr>
-          <w:rFonts w:ascii="Arial" w:eastAsia="Arial" w:hAnsi="Arial" w:cs="Arial"/>
-          <w:b/>
-          <w:sz w:val="32"/>
-          <w:szCs w:val="32"/>
-        </w:rPr>
-        <w:t>ESTUDIOS</w:t>
-      </w:r>
-      <w:r>
-        <w:rPr>
-          <w:rFonts w:ascii="Arial" w:eastAsia="Arial" w:hAnsi="Arial" w:cs="Arial"/>
-          <w:b/>
-          <w:sz w:val="32"/>
-          <w:szCs w:val="32"/>
-        </w:rPr>
-        <w:t xml:space="preserve"> DE </w:t>
-      </w:r>
-      <w:sdt>
-        <w:sdtPr>
-          <w:rPr>
-            <w:rStyle w:val="Estilo1"/>
-          </w:rPr>
-          <w:id w:val="-656376293"/>
-          <w:placeholder>
-            <w:docPart w:val="CFE572CD30954475B873094DD062395C"/>
-          </w:placeholder>
-          <w:dropDownList>
-            <w:listItem w:displayText="EDUCACIÓN INICIAL" w:value="EDUCACIÓN INICIAL"/>
-            <w:listItem w:displayText="EDUCACIÓN PRIMARIA" w:value="EDUCACIÓN PRIMARIA"/>
-            <w:listItem w:displayText="EDUCACIÓN PRIMARIA INTERCULTURAL BILINGÜE" w:value="EDUCACIÓN PRIMARIA INTERCULTURAL BILINGÜE"/>
-          </w:dropDownList>
-        </w:sdtPr>
-        <w:sdtEndPr>
-          <w:rPr>
-            <w:rStyle w:val="Fuentedeprrafopredeter"/>
-            <w:rFonts w:ascii="Calibri" w:eastAsia="Arial" w:hAnsi="Calibri" w:cs="Arial"/>
-            <w:b w:val="0"/>
-            <w:sz w:val="22"/>
-            <w:szCs w:val="32"/>
-          </w:rPr>
-        </w:sdtEndPr>
-        <w:sdtContent>
-          <w:r>
-            <w:rPr>
-              <w:rStyle w:val="Estilo1"/>
-            </w:rPr>
-            <w:t>SELECCIONE EL PROGRAMA DE ESTUDIOS</w:t>
-          </w:r>
-        </w:sdtContent>
-      </w:sdt>
-    </w:p>
-    <w:p>
-      <w:pPr>
-        <w:spacing w:after="0" w:line="360" w:lineRule="auto"/>
-        <w:jc w:val="center"/>
-        <w:rPr>
-          <w:rFonts w:ascii="Arial" w:eastAsia="Arial" w:hAnsi="Arial" w:cs="Arial"/>
-          <w:b/>
-          <w:sz w:val="28"/>
-          <w:szCs w:val="28"/>
-        </w:rPr>
-      </w:pPr>
-      <w:r>
-        <w:rPr>
-          <w:rFonts w:ascii="Arial" w:eastAsia="Arial" w:hAnsi="Arial" w:cs="Arial"/>
-          <w:noProof/>
-          <w:sz w:val="24"/>
-          <w:szCs w:val="24"/>
-        </w:rPr>
-        <w:drawing>
-          <wp:inline distT="0" distB="0" distL="0" distR="0" wp14:anchorId="3331D8C9" wp14:editId="1A56720F">
-            <wp:extent cx="4109199" cy="1902954"/>
-            <wp:effectExtent l="0" t="0" r="0" b="0"/>
-            <wp:docPr id="1" name="image1.png"/>
-            <wp:cNvGraphicFramePr/>
-            <a:graphic xmlns:a="http://schemas.openxmlformats.org/drawingml/2006/main">
-              <a:graphicData uri="http://schemas.openxmlformats.org/drawingml/2006/picture">
-                <pic:pic xmlns:pic="http://schemas.openxmlformats.org/drawingml/2006/picture">
-                  <pic:nvPicPr>
-                    <pic:cNvPr id="0" name="image1.png"/>
-                    <pic:cNvPicPr preferRelativeResize="0"/>
-                  </pic:nvPicPr>
-                  <pic:blipFill>
-                    <a:blip r:embed="rId5"/>
-                    <a:srcRect/>
-                    <a:stretch>
-                      <a:fillRect/>
-                    </a:stretch>
-                  </pic:blipFill>
-                  <pic:spPr>
-                    <a:xfrm>
-                      <a:off x="0" y="0"/>
-                      <a:ext cx="4109199" cy="1902954"/>
-                    </a:xfrm>
-                    <a:prstGeom prst="rect">
-                      <a:avLst/>
-                    </a:prstGeom>
-                    <a:ln/>
-                  </pic:spPr>
-                </pic:pic>
-              </a:graphicData>
-            </a:graphic>
-          </wp:inline>
-        </w:drawing>
-      </w:r>
-    </w:p>
-    <w:p>
-      <w:pPr>
-        <w:spacing w:after="0" w:line="360" w:lineRule="auto"/>
-        <w:jc w:val="center"/>
-        <w:rPr>
-          <w:rFonts w:ascii="Arial" w:eastAsia="Arial" w:hAnsi="Arial" w:cs="Arial"/>
-          <w:b/>
-          <w:sz w:val="28"/>
-          <w:szCs w:val="28"/>
-        </w:rPr>
-      </w:pPr>
-      <w:r>
-        <w:rPr>
-          <w:rFonts w:ascii="Arial" w:eastAsia="Arial" w:hAnsi="Arial" w:cs="Arial"/>
-          <w:b/>
-          <w:sz w:val="28"/>
-          <w:szCs w:val="28"/>
-        </w:rPr>
-        <w:t>Título de la tesis</w:t>
-      </w:r>
-    </w:p>
-    <w:p>
-      <w:pPr>
-        <w:spacing w:after="0" w:line="360" w:lineRule="auto"/>
-        <w:jc w:val="center"/>
-        <w:rPr>
-          <w:rFonts w:ascii="Arial" w:eastAsia="Arial" w:hAnsi="Arial" w:cs="Arial"/>
-          <w:bCs/>
-          <w:sz w:val="28"/>
-          <w:szCs w:val="28"/>
-        </w:rPr>
-      </w:pPr>
-      <w:r>
-        <w:rPr>
-          <w:rFonts w:ascii="Arial" w:eastAsia="Arial" w:hAnsi="Arial" w:cs="Arial"/>
-          <w:bCs/>
-          <w:sz w:val="28"/>
-          <w:szCs w:val="28"/>
-        </w:rPr>
-        <w:t>T</w:t>
-      </w:r>
-      <w:r>
-        <w:rPr>
-          <w:rFonts w:ascii="Arial" w:eastAsia="Arial" w:hAnsi="Arial" w:cs="Arial"/>
-          <w:bCs/>
-          <w:sz w:val="28"/>
-          <w:szCs w:val="28"/>
-        </w:rPr>
-        <w:t>esis</w:t>
-      </w:r>
-      <w:r>
-        <w:rPr>
-          <w:rFonts w:ascii="Arial" w:eastAsia="Arial" w:hAnsi="Arial" w:cs="Arial"/>
-          <w:bCs/>
-          <w:sz w:val="28"/>
-          <w:szCs w:val="28"/>
-        </w:rPr>
-        <w:t xml:space="preserve"> para optar </w:t>
-      </w:r>
-      <w:r>
-        <w:rPr>
-          <w:rFonts w:ascii="Arial" w:eastAsia="Arial" w:hAnsi="Arial" w:cs="Arial"/>
-          <w:bCs/>
-          <w:sz w:val="28"/>
-          <w:szCs w:val="28"/>
-        </w:rPr>
-        <w:t xml:space="preserve">el título profesional de Licenciado </w:t>
-      </w:r>
-      <w:r>
-        <w:rPr>
-          <w:rFonts w:ascii="Arial" w:eastAsia="Arial" w:hAnsi="Arial" w:cs="Arial"/>
-          <w:bCs/>
-          <w:sz w:val="28"/>
-          <w:szCs w:val="28"/>
-        </w:rPr>
-        <w:t xml:space="preserve">en </w:t>
-      </w:r>
-      <w:sdt>
-        <w:sdtPr>
-          <w:rPr>
-            <w:rStyle w:val="Estilo2"/>
-          </w:rPr>
-          <w:id w:val="579177891"/>
-          <w:placeholder>
-            <w:docPart w:val="407876DA56B4488DAA79E6363BC10214"/>
-          </w:placeholder>
-          <w:dropDownList>
-            <w:listItem w:displayText="Educación Inicial" w:value="Educación Inicial"/>
-            <w:listItem w:displayText="Educación Primaria" w:value="Educación Primaria"/>
-            <w:listItem w:displayText="Educación Primaria Intercultural Bilingüe" w:value="Educación Primaria Intercultural Bilingüe"/>
-          </w:dropDownList>
-        </w:sdtPr>
-        <w:sdtEndPr>
-          <w:rPr>
-            <w:rStyle w:val="Estilo2"/>
-          </w:rPr>
-        </w:sdtEndPr>
-        <w:sdtContent>
-          <w:r>
-            <w:rPr>
-              <w:rStyle w:val="Estilo2"/>
-            </w:rPr>
-            <w:t>Seleccione el programa de estudios</w:t>
-          </w:r>
-        </w:sdtContent>
-      </w:sdt>
-    </w:p>
-    <w:p>
-      <w:pPr>
-        <w:spacing w:after="0" w:line="360" w:lineRule="auto"/>
-        <w:jc w:val="center"/>
-        <w:rPr>
-          <w:rFonts w:ascii="Arial" w:eastAsia="Arial" w:hAnsi="Arial" w:cs="Arial"/>
-          <w:bCs/>
-          <w:sz w:val="28"/>
-          <w:szCs w:val="28"/>
-        </w:rPr>
-      </w:pPr>
-    </w:p>
-    <w:p>
-      <w:pPr>
-        <w:spacing w:after="0" w:line="360" w:lineRule="auto"/>
-        <w:jc w:val="center"/>
-        <w:rPr>
-          <w:rFonts w:ascii="Arial" w:eastAsia="Arial" w:hAnsi="Arial" w:cs="Arial"/>
-          <w:b/>
-          <w:sz w:val="24"/>
-          <w:szCs w:val="24"/>
-        </w:rPr>
-      </w:pPr>
-      <w:r>
-        <w:rPr>
-          <w:rFonts w:ascii="Arial" w:eastAsia="Arial" w:hAnsi="Arial" w:cs="Arial"/>
-          <w:b/>
-          <w:sz w:val="24"/>
-          <w:szCs w:val="24"/>
-        </w:rPr>
-        <w:t>Presentada por</w:t>
-      </w:r>
-      <w:r>
-        <w:rPr>
-          <w:rFonts w:ascii="Arial" w:eastAsia="Arial" w:hAnsi="Arial" w:cs="Arial"/>
-          <w:b/>
-          <w:sz w:val="24"/>
-          <w:szCs w:val="24"/>
-        </w:rPr>
-        <w:t>:</w:t>
-      </w:r>
-    </w:p>
-    <w:p>
-      <w:pPr>
-        <w:spacing w:after="0" w:line="360" w:lineRule="auto"/>
-        <w:jc w:val="center"/>
-        <w:rPr>
-          <w:rFonts w:ascii="Arial" w:eastAsia="Arial" w:hAnsi="Arial" w:cs="Arial"/>
-          <w:sz w:val="24"/>
-          <w:szCs w:val="24"/>
-        </w:rPr>
-      </w:pPr>
-      <w:r>
-        <w:rPr>
-          <w:rFonts w:ascii="Arial" w:eastAsia="Arial" w:hAnsi="Arial" w:cs="Arial"/>
-          <w:sz w:val="24"/>
-          <w:szCs w:val="24"/>
-        </w:rPr>
-        <w:t xml:space="preserve">Br. </w:t>
-      </w:r>
-      <w:r>
-        <w:rPr>
-          <w:rFonts w:ascii="Arial" w:eastAsia="Arial" w:hAnsi="Arial" w:cs="Arial"/>
-          <w:sz w:val="24"/>
-          <w:szCs w:val="24"/>
-        </w:rPr>
-        <w:t>Apellidos, Nombres (ORCID</w:t>
-      </w:r>
-      <w:r>
-        <w:rPr>
-          <w:rFonts w:ascii="Arial" w:eastAsia="Arial" w:hAnsi="Arial" w:cs="Arial"/>
-          <w:sz w:val="24"/>
-          <w:szCs w:val="24"/>
-        </w:rPr>
-        <w:t>:</w:t>
-      </w:r>
-      <w:r>
-        <w:rPr>
-          <w:rFonts w:ascii="Arial" w:eastAsia="Arial" w:hAnsi="Arial" w:cs="Arial"/>
-          <w:sz w:val="24"/>
-          <w:szCs w:val="24"/>
-        </w:rPr>
-        <w:t>)</w:t>
-      </w:r>
-    </w:p>
-    <w:p>
-      <w:pPr>
-        <w:spacing w:after="0" w:line="360" w:lineRule="auto"/>
-        <w:jc w:val="center"/>
-        <w:rPr>
-          <w:rFonts w:ascii="Arial" w:eastAsia="Arial" w:hAnsi="Arial" w:cs="Arial"/>
-          <w:sz w:val="24"/>
-          <w:szCs w:val="24"/>
-        </w:rPr>
-      </w:pPr>
-    </w:p>
-    <w:p>
-      <w:pPr>
-        <w:spacing w:after="0" w:line="360" w:lineRule="auto"/>
-        <w:jc w:val="center"/>
-        <w:rPr>
-          <w:rFonts w:ascii="Arial" w:eastAsia="Arial" w:hAnsi="Arial" w:cs="Arial"/>
-          <w:b/>
-          <w:bCs/>
-          <w:sz w:val="24"/>
-          <w:szCs w:val="24"/>
-        </w:rPr>
-      </w:pPr>
-      <w:r>
-        <w:rPr>
-          <w:rFonts w:ascii="Arial" w:eastAsia="Arial" w:hAnsi="Arial" w:cs="Arial"/>
-          <w:b/>
-          <w:bCs/>
-          <w:sz w:val="24"/>
-          <w:szCs w:val="24"/>
-        </w:rPr>
-        <w:t>APROBADO POR:</w:t>
-      </w:r>
-    </w:p>
-    <w:p>
-      <w:pPr>
-        <w:tabs>
-          <w:tab w:val="left" w:pos="3828"/>
-        </w:tabs>
-        <w:spacing w:before="240" w:after="0" w:line="360" w:lineRule="auto"/>
-        <w:jc w:val="both"/>
-        <w:rPr>
-          <w:rFonts w:ascii="Arial" w:eastAsia="Arial" w:hAnsi="Arial" w:cs="Arial"/>
-          <w:sz w:val="24"/>
-          <w:szCs w:val="24"/>
-        </w:rPr>
-      </w:pPr>
-      <w:r>
-        <w:rPr>
-          <w:rFonts w:ascii="Arial" w:eastAsia="Arial" w:hAnsi="Arial" w:cs="Arial"/>
-          <w:sz w:val="24"/>
-          <w:szCs w:val="24"/>
-        </w:rPr>
-        <w:t>PRESIDENTE DEL JURADO</w:t>
-      </w:r>
-      <w:r>
-        <w:rPr>
-          <w:rFonts w:ascii="Arial" w:eastAsia="Arial" w:hAnsi="Arial" w:cs="Arial"/>
-          <w:sz w:val="24"/>
-          <w:szCs w:val="24"/>
-        </w:rPr>
-        <w:tab/>
-        <w:t>: ____________________________________</w:t>
-      </w:r>
-    </w:p>
-    <w:p>
-      <w:pPr>
-        <w:tabs>
-          <w:tab w:val="left" w:pos="3828"/>
-        </w:tabs>
-        <w:spacing w:after="0" w:line="360" w:lineRule="auto"/>
-        <w:ind w:left="3969"/>
-        <w:jc w:val="both"/>
-        <w:rPr>
-          <w:rFonts w:ascii="Arial" w:eastAsia="Arial" w:hAnsi="Arial" w:cs="Arial"/>
-          <w:sz w:val="24"/>
-          <w:szCs w:val="24"/>
-        </w:rPr>
-      </w:pPr>
-      <w:r>
-        <w:rPr>
-          <w:rFonts w:ascii="Arial" w:eastAsia="Arial" w:hAnsi="Arial" w:cs="Arial"/>
-          <w:sz w:val="24"/>
-          <w:szCs w:val="24"/>
-        </w:rPr>
-        <w:t xml:space="preserve">Mg. </w:t>
-      </w:r>
-      <w:r>
-        <w:rPr>
-          <w:rFonts w:ascii="Arial" w:eastAsia="Arial" w:hAnsi="Arial" w:cs="Arial"/>
-          <w:sz w:val="24"/>
-          <w:szCs w:val="24"/>
-        </w:rPr>
-        <w:t xml:space="preserve">Cecilia María </w:t>
-      </w:r>
-      <w:proofErr w:type="spellStart"/>
-      <w:r>
-        <w:rPr>
-          <w:rFonts w:ascii="Arial" w:eastAsia="Arial" w:hAnsi="Arial" w:cs="Arial"/>
-          <w:sz w:val="24"/>
-          <w:szCs w:val="24"/>
-        </w:rPr>
-        <w:t>Eguiluz</w:t>
-      </w:r>
-      <w:proofErr w:type="spellEnd"/>
-      <w:r>
-        <w:rPr>
-          <w:rFonts w:ascii="Arial" w:eastAsia="Arial" w:hAnsi="Arial" w:cs="Arial"/>
-          <w:sz w:val="24"/>
-          <w:szCs w:val="24"/>
-        </w:rPr>
-        <w:t xml:space="preserve"> Duffy</w:t>
-      </w:r>
-    </w:p>
-    <w:p>
-      <w:pPr>
-        <w:tabs>
-          <w:tab w:val="left" w:pos="3828"/>
-        </w:tabs>
-        <w:spacing w:before="240" w:after="0" w:line="360" w:lineRule="auto"/>
-        <w:jc w:val="both"/>
-        <w:rPr>
-          <w:rFonts w:ascii="Arial" w:eastAsia="Arial" w:hAnsi="Arial" w:cs="Arial"/>
-          <w:sz w:val="24"/>
-          <w:szCs w:val="24"/>
-        </w:rPr>
-      </w:pPr>
-      <w:r>
-        <w:rPr>
-          <w:rFonts w:ascii="Arial" w:eastAsia="Arial" w:hAnsi="Arial" w:cs="Arial"/>
-          <w:sz w:val="24"/>
-          <w:szCs w:val="24"/>
-        </w:rPr>
-        <w:t>PRIMER MIEMBRO DEL JURADO</w:t>
-      </w:r>
-      <w:r>
-        <w:rPr>
-          <w:rFonts w:ascii="Arial" w:eastAsia="Arial" w:hAnsi="Arial" w:cs="Arial"/>
-          <w:sz w:val="24"/>
-          <w:szCs w:val="24"/>
-        </w:rPr>
-        <w:tab/>
-        <w:t>: ____________________________________</w:t>
-      </w:r>
-    </w:p>
-    <w:p>
-      <w:pPr>
-        <w:tabs>
-          <w:tab w:val="left" w:pos="3828"/>
-        </w:tabs>
-        <w:spacing w:after="0" w:line="360" w:lineRule="auto"/>
-        <w:ind w:left="3969"/>
-        <w:jc w:val="both"/>
-        <w:rPr>
-          <w:rFonts w:ascii="Arial" w:eastAsia="Arial" w:hAnsi="Arial" w:cs="Arial"/>
-          <w:sz w:val="24"/>
-          <w:szCs w:val="24"/>
-        </w:rPr>
-      </w:pPr>
-      <w:r>
-        <w:rPr>
-          <w:rFonts w:ascii="Arial" w:eastAsia="Arial" w:hAnsi="Arial" w:cs="Arial"/>
-          <w:sz w:val="24"/>
-          <w:szCs w:val="24"/>
-        </w:rPr>
-        <w:t>Dr./Mg. (Nombres y apellidos)</w:t>
-      </w:r>
-    </w:p>
-    <w:p>
-      <w:pPr>
-        <w:tabs>
-          <w:tab w:val="left" w:pos="3828"/>
-        </w:tabs>
-        <w:spacing w:before="240" w:after="0" w:line="360" w:lineRule="auto"/>
-        <w:jc w:val="both"/>
-        <w:rPr>
-          <w:rFonts w:ascii="Arial" w:eastAsia="Arial" w:hAnsi="Arial" w:cs="Arial"/>
-          <w:sz w:val="24"/>
-          <w:szCs w:val="24"/>
-        </w:rPr>
-      </w:pPr>
-      <w:r>
-        <w:rPr>
-          <w:rFonts w:ascii="Arial" w:eastAsia="Arial" w:hAnsi="Arial" w:cs="Arial"/>
-          <w:sz w:val="24"/>
-          <w:szCs w:val="24"/>
-        </w:rPr>
-        <w:t>SEGUNDO MIEMBRO DEL JURADO</w:t>
-      </w:r>
-      <w:r>
-        <w:rPr>
-          <w:rFonts w:ascii="Arial" w:eastAsia="Arial" w:hAnsi="Arial" w:cs="Arial"/>
-          <w:sz w:val="24"/>
-          <w:szCs w:val="24"/>
-        </w:rPr>
-        <w:tab/>
-        <w:t>: ________________________________</w:t>
-      </w:r>
-    </w:p>
-    <w:p>
-      <w:pPr>
-        <w:tabs>
-          <w:tab w:val="left" w:pos="3828"/>
-        </w:tabs>
-        <w:spacing w:after="0" w:line="360" w:lineRule="auto"/>
-        <w:ind w:left="3969"/>
-        <w:jc w:val="both"/>
-        <w:rPr>
-          <w:rFonts w:ascii="Arial" w:eastAsia="Arial" w:hAnsi="Arial" w:cs="Arial"/>
-          <w:sz w:val="24"/>
-          <w:szCs w:val="24"/>
-        </w:rPr>
-      </w:pPr>
-      <w:r>
-        <w:rPr>
-          <w:rFonts w:ascii="Arial" w:eastAsia="Arial" w:hAnsi="Arial" w:cs="Arial"/>
-          <w:sz w:val="24"/>
-          <w:szCs w:val="24"/>
-        </w:rPr>
-        <w:t>Dr./Mg. (Nombres y apellidos)</w:t>
-      </w:r>
-    </w:p>
-    <w:p>
-      <w:pPr>
-        <w:tabs>
-          <w:tab w:val="left" w:pos="3828"/>
-        </w:tabs>
-        <w:spacing w:before="240" w:after="0" w:line="360" w:lineRule="auto"/>
-        <w:jc w:val="both"/>
-        <w:rPr>
-          <w:rFonts w:ascii="Arial" w:eastAsia="Arial" w:hAnsi="Arial" w:cs="Arial"/>
-          <w:sz w:val="24"/>
-          <w:szCs w:val="24"/>
-        </w:rPr>
-      </w:pPr>
-      <w:r>
-        <w:rPr>
-          <w:rFonts w:ascii="Arial" w:eastAsia="Arial" w:hAnsi="Arial" w:cs="Arial"/>
-          <w:sz w:val="24"/>
-          <w:szCs w:val="24"/>
-        </w:rPr>
-        <w:t>ASESOR(A) DE TESIS</w:t>
-      </w:r>
-      <w:r>
-        <w:rPr>
-          <w:rFonts w:ascii="Arial" w:eastAsia="Arial" w:hAnsi="Arial" w:cs="Arial"/>
-          <w:sz w:val="24"/>
-          <w:szCs w:val="24"/>
-        </w:rPr>
-        <w:tab/>
-        <w:t>: ____________________________________</w:t>
-      </w:r>
-    </w:p>
-    <w:p>
-      <w:pPr>
-        <w:spacing w:after="0" w:line="360" w:lineRule="auto"/>
-        <w:ind w:left="2410"/>
-        <w:jc w:val="center"/>
-        <w:rPr>
-          <w:rFonts w:ascii="Arial" w:eastAsia="Arial" w:hAnsi="Arial" w:cs="Arial"/>
-          <w:sz w:val="24"/>
-          <w:szCs w:val="24"/>
-        </w:rPr>
-      </w:pPr>
-      <w:r>
-        <w:rPr>
-          <w:rFonts w:ascii="Arial" w:eastAsia="Arial" w:hAnsi="Arial" w:cs="Arial"/>
-          <w:sz w:val="24"/>
-          <w:szCs w:val="24"/>
-        </w:rPr>
-        <w:t>Dr./Mg. (Nombres y apellidos)</w:t>
-      </w:r>
-    </w:p>
-    <w:p>
-      <w:pPr>
-        <w:spacing w:after="0" w:line="360" w:lineRule="auto"/>
-        <w:jc w:val="right"/>
-        <w:rPr>
-          <w:rFonts w:ascii="Arial" w:eastAsia="Arial" w:hAnsi="Arial" w:cs="Arial"/>
-          <w:sz w:val="24"/>
-          <w:szCs w:val="24"/>
-        </w:rPr>
-      </w:pPr>
-      <w:r>
-        <w:rPr>
-          <w:rFonts w:ascii="Arial" w:eastAsia="Arial" w:hAnsi="Arial" w:cs="Arial"/>
-          <w:sz w:val="24"/>
-          <w:szCs w:val="24"/>
-        </w:rPr>
-        <w:t xml:space="preserve">Cusco, </w:t>
-      </w:r>
-      <w:r>
-        <w:rPr>
-          <w:rFonts w:ascii="Arial" w:eastAsia="Arial" w:hAnsi="Arial" w:cs="Arial"/>
-          <w:sz w:val="24"/>
-          <w:szCs w:val="24"/>
-        </w:rPr>
-        <w:t>__</w:t>
-      </w:r>
-      <w:r>
-        <w:rPr>
-          <w:rFonts w:ascii="Arial" w:eastAsia="Arial" w:hAnsi="Arial" w:cs="Arial"/>
-          <w:sz w:val="24"/>
-          <w:szCs w:val="24"/>
-        </w:rPr>
-        <w:t xml:space="preserve"> de </w:t>
-      </w:r>
-      <w:r>
-        <w:rPr>
-          <w:rFonts w:ascii="Arial" w:eastAsia="Arial" w:hAnsi="Arial" w:cs="Arial"/>
-          <w:sz w:val="24"/>
-          <w:szCs w:val="24"/>
-        </w:rPr>
-        <w:t>__________</w:t>
-      </w:r>
-      <w:r>
-        <w:rPr>
-          <w:rFonts w:ascii="Arial" w:eastAsia="Arial" w:hAnsi="Arial" w:cs="Arial"/>
-          <w:sz w:val="24"/>
-          <w:szCs w:val="24"/>
-        </w:rPr>
-        <w:t xml:space="preserve"> </w:t>
-      </w:r>
-      <w:proofErr w:type="spellStart"/>
-      <w:r>
-        <w:rPr>
-          <w:rFonts w:ascii="Arial" w:eastAsia="Arial" w:hAnsi="Arial" w:cs="Arial"/>
-          <w:sz w:val="24"/>
-          <w:szCs w:val="24"/>
-        </w:rPr>
-        <w:t>de</w:t>
-      </w:r>
-      <w:proofErr w:type="spellEnd"/>
-      <w:r>
-        <w:rPr>
-          <w:rFonts w:ascii="Arial" w:eastAsia="Arial" w:hAnsi="Arial" w:cs="Arial"/>
-          <w:sz w:val="24"/>
-          <w:szCs w:val="24"/>
-        </w:rPr>
-        <w:t xml:space="preserve"> 202</w:t>
-      </w:r>
-      <w:r>
-        <w:rPr>
-          <w:rFonts w:ascii="Arial" w:eastAsia="Arial" w:hAnsi="Arial" w:cs="Arial"/>
-          <w:sz w:val="24"/>
-          <w:szCs w:val="24"/>
-        </w:rPr>
-        <w:t>_</w:t>
       </w:r>
     </w:p>
     <w:sectPr>
@@ -2149,80 +1429,6 @@
         </w:p>
       </w:docPartBody>
     </w:docPart>
-    <w:docPart>
-      <w:docPartPr>
-        <w:name w:val="CFE572CD30954475B873094DD062395C"/>
-        <w:category>
-          <w:name w:val="General"/>
-          <w:gallery w:val="placeholder"/>
-        </w:category>
-        <w:types>
-          <w:type w:val="bbPlcHdr"/>
-        </w:types>
-        <w:behaviors>
-          <w:behavior w:val="content"/>
-        </w:behaviors>
-        <w:guid w:val="{61807F7C-DCAA-45E2-B414-4484DC1341E4}"/>
-      </w:docPartPr>
-      <w:docPartBody>
-        <w:p>
-          <w:pPr>
-            <w:pStyle w:val="CFE572CD30954475B873094DD062395C"/>
-          </w:pPr>
-          <w:r>
-            <w:rPr>
-              <w:rStyle w:val="Textodelmarcadordeposicin"/>
-              <w:rFonts w:ascii="Arial" w:hAnsi="Arial" w:cs="Arial"/>
-            </w:rPr>
-            <w:t>SELECCIONA EL PROGRAMA DE ESTUDIOS</w:t>
-          </w:r>
-          <w:r>
-            <w:rPr>
-              <w:rStyle w:val="Textodelmarcadordeposicin"/>
-              <w:rFonts w:ascii="Arial" w:hAnsi="Arial" w:cs="Arial"/>
-            </w:rPr>
-            <w:t>.</w:t>
-          </w:r>
-        </w:p>
-      </w:docPartBody>
-    </w:docPart>
-    <w:docPart>
-      <w:docPartPr>
-        <w:name w:val="407876DA56B4488DAA79E6363BC10214"/>
-        <w:category>
-          <w:name w:val="General"/>
-          <w:gallery w:val="placeholder"/>
-        </w:category>
-        <w:types>
-          <w:type w:val="bbPlcHdr"/>
-        </w:types>
-        <w:behaviors>
-          <w:behavior w:val="content"/>
-        </w:behaviors>
-        <w:guid w:val="{1047A043-587B-4474-BF7A-40426F6E0866}"/>
-      </w:docPartPr>
-      <w:docPartBody>
-        <w:p>
-          <w:pPr>
-            <w:pStyle w:val="407876DA56B4488DAA79E6363BC10214"/>
-          </w:pPr>
-          <w:r>
-            <w:rPr>
-              <w:rStyle w:val="Textodelmarcadordeposicin"/>
-              <w:rFonts w:ascii="Arial" w:hAnsi="Arial" w:cs="Arial"/>
-            </w:rPr>
-            <w:t>SELECCIONA EL PROGRAMA DE ESTUDIOS</w:t>
-          </w:r>
-          <w:r>
-            <w:rPr>
-              <w:rStyle w:val="Textodelmarcadordeposicin"/>
-              <w:rFonts w:ascii="Arial" w:hAnsi="Arial" w:cs="Arial"/>
-            </w:rPr>
-            <w:t>.</w:t>
-          </w:r>
-        </w:p>
-      </w:docPartBody>
-    </w:docPart>
   </w:docParts>
 </w:glossaryDocument>
 </file>
@@ -2234,14 +1440,14 @@
     <w:charset w:val="00"/>
     <w:family w:val="swiss"/>
     <w:pitch w:val="variable"/>
-    <w:sig w:usb0="E0002AFF" w:usb1="4000ACFF" w:usb2="00000001" w:usb3="00000000" w:csb0="000001FF" w:csb1="00000000"/>
+    <w:sig w:usb0="E4002EFF" w:usb1="C000247B" w:usb2="00000009" w:usb3="00000000" w:csb0="000001FF" w:csb1="00000000"/>
   </w:font>
   <w:font w:name="Times New Roman">
     <w:panose1 w:val="02020603050405020304"/>
     <w:charset w:val="00"/>
     <w:family w:val="roman"/>
     <w:pitch w:val="variable"/>
-    <w:sig w:usb0="E0002AFF" w:usb1="C0007843" w:usb2="00000009" w:usb3="00000000" w:csb0="000001FF" w:csb1="00000000"/>
+    <w:sig w:usb0="E0002EFF" w:usb1="C000785B" w:usb2="00000009" w:usb3="00000000" w:csb0="000001FF" w:csb1="00000000"/>
   </w:font>
   <w:font w:name="Georgia">
     <w:panose1 w:val="02040502050405020303"/>
@@ -2255,14 +1461,14 @@
     <w:charset w:val="00"/>
     <w:family w:val="swiss"/>
     <w:pitch w:val="variable"/>
-    <w:sig w:usb0="E0002AFF" w:usb1="C0007843" w:usb2="00000009" w:usb3="00000000" w:csb0="000001FF" w:csb1="00000000"/>
+    <w:sig w:usb0="E0002EFF" w:usb1="C000785B" w:usb2="00000009" w:usb3="00000000" w:csb0="000001FF" w:csb1="00000000"/>
   </w:font>
   <w:font w:name="Calibri Light">
     <w:panose1 w:val="020F0302020204030204"/>
     <w:charset w:val="00"/>
     <w:family w:val="swiss"/>
     <w:pitch w:val="variable"/>
-    <w:sig w:usb0="A0002AEF" w:usb1="4000207B" w:usb2="00000000" w:usb3="00000000" w:csb0="000001FF" w:csb1="00000000"/>
+    <w:sig w:usb0="E4002EFF" w:usb1="C000247B" w:usb2="00000009" w:usb3="00000000" w:csb0="000001FF" w:csb1="00000000"/>
   </w:font>
 </w:fonts>
 </file>
@@ -2287,6 +1493,7 @@
     <w:rsid w:val="0020189C"/>
     <w:rsid w:val="007C1DE2"/>
     <w:rsid w:val="00A1343F"/>
+    <w:rsid w:val="00C6188F"/>
     <w:rsid w:val="00D92BAD"/>
   </w:rsids>
   <m:mathPr>

</xml_diff>